<commit_message>
Implement resumable Blocked and rejected-count claim gate
Blocked now resumes to the state it interrupted under that state's own
gates; start_session records the observed rejected-event count and
strict claims require it to be zero. Tests, skill, hook, PRD and
coverage matrix updated.

Co-Authored-By: Claude Opus 5.5 <noreply@anthropic.com>
</commit_message>
<xml_diff>
--- a/requirements/Cogumi_Claude_Kanban_PRD.docx
+++ b/requirements/Cogumi_Claude_Kanban_PRD.docx
@@ -625,7 +625,7 @@
           <w:sz-cs w:val="29"/>
           <w:spacing w:val="0"/>
         </w:rPr>
-        <w:t xml:space="preserve">Normal flow: Draft → Backlog → Ready → Implementing → Verifying → Ready to ship → Shipped. Draft holds unclear or unreviewed requests. Blocked records a reason, the prior state, the next action and the responsible dependency; work resumes from Blocked through Backlog → Ready and a fresh claim, so the previous attempt is ended explicitly rather than silently continued. Needs rework withdraws current completion eligibility after a human reports incomplete behavior. Proof that stops qualifying (a failed check, a source change, rework) demotes Ready to ship to Verifying and Shipped to Needs rework; a worker may also move Verifying back to Implementing. Historical releases remain preserved.</w:t>
+        <w:t xml:space="preserve">Normal flow: Draft → Backlog → Ready → Implementing → Verifying → Ready to ship → Shipped. Draft holds unclear or unreviewed requests. Blocked records a reason, the prior state, the next action and the responsible dependency, and keeps the current attempt; when the blocker clears the story resumes to exactly the state it interrupted, subject to that state's own gates (an active lease, qualifying proof), or the owner moves it to Backlog to end the attempt. Needs rework withdraws current completion eligibility after a human reports incomplete behavior. Proof that stops qualifying (a failed check, a source change, rework) demotes Ready to ship to Verifying and Shipped to Needs rework; a worker may also move Verifying back to Implementing. Historical releases remain preserved.</w:t>
       </w:r>
     </w:p>
     <w:p>
@@ -5856,7 +5856,7 @@
           <w:sz-cs w:val="29"/>
           <w:spacing w:val="0"/>
         </w:rPr>
-        <w:t xml:space="preserve">A permanently rejected outbox event is moved to the rejected area with its reason, later events are still delivered, the affected run is recorded as blocked, and </w:t>
+        <w:t xml:space="preserve">A permanently rejected outbox event is moved to the rejected area with its reason, later events are still delivered, the affected run is recorded as blocked, </w:t>
       </w:r>
       <w:r>
         <w:rPr>
@@ -5874,7 +5874,7 @@
           <w:sz-cs w:val="29"/>
           <w:spacing w:val="0"/>
         </w:rPr>
-        <w:t xml:space="preserve">, the SessionStart hook and the checkpoint's delivery error surface the rejected events (start_session itself records only the pending count).</w:t>
+        <w:t xml:space="preserve">, the SessionStart hook and the checkpoint's delivery error surface the rejected events, and start_session records the observed rejected count so a strict claim is refused while it is above zero.</w:t>
       </w:r>
     </w:p>
     <w:p>

</xml_diff>

<commit_message>
Remove Abovely: project-neutral PRD and sample backlog
Abovely is a separate product. The PRD no longer names it as the first
project, and the Abovely sample is replaced by a neutral sample backlog.

Co-Authored-By: Claude Opus 5.5 <noreply@anthropic.com>
</commit_message>
<xml_diff>
--- a/requirements/Cogumi_Claude_Kanban_PRD.docx
+++ b/requirements/Cogumi_Claude_Kanban_PRD.docx
@@ -42,7 +42,7 @@
           <w:sz-cs w:val="29"/>
           <w:spacing w:val="0"/>
         </w:rPr>
-        <w:t xml:space="preserve">Cogumi Claude Kanban is a private visual development tracker that ships as a Claude Code plugin. Claude Code updates it while implementing, testing and releasing approved work. All records live in a local SQLite database on the owner's machine; the Kanban board is a Claude Artifact that reads the plugin's local MCP server live. It starts with Abovely and supports other projects through a reusable project model. This PRD describes the intended product, functional acceptance criteria and verified evidence requirements; it does not initiate development or an autonomous worker.</w:t>
+        <w:t xml:space="preserve">Cogumi Claude Kanban is a private visual development tracker that ships as a Claude Code plugin. Claude Code updates it while implementing, testing and releasing approved work. All records live in a local SQLite database on the owner's machine; the Kanban board is a Claude Artifact that reads the plugin's local MCP server live. It tracks any number of projects through a reusable project model. This PRD describes the intended product, functional acceptance criteria and verified evidence requirements; it does not initiate development or an autonomous worker.</w:t>
       </w:r>
     </w:p>
     <w:p>
@@ -128,7 +128,7 @@
           <w:sz-cs w:val="29"/>
           <w:spacing w:val="0"/>
         </w:rPr>
-        <w:t xml:space="preserve">Owner: Vivek, the local machine user, viewing progress and approving scope in chat or on the board. Worker: an active Claude Code session that selects and implements work. Reporter: local test or deployment scripts that submit objective results. Initial project: Abovely personal MVP (sample data, not hardcoded behavior).</w:t>
+        <w:t xml:space="preserve">Owner: Vivek, the local machine user, viewing progress and approving scope in chat or on the board. Worker: an active Claude Code session that selects and implements work. Reporter: local test or deployment scripts that submit objective results. Projects are whatever the owner creates or imports; nothing about a particular project is built into the product.</w:t>
       </w:r>
     </w:p>
     <w:p>
@@ -225,7 +225,7 @@
           <w:sz-cs w:val="24"/>
           <w:spacing w:val="0"/>
         </w:rPr>
-        <w:t xml:space="preserve">One owner on one machine, multiple project capable schema, Abovely sample import, Artifact board plus snapshot fallback, MCP workflow, script reporting, evidence gates, local retry queue, resume recovery, plugin packaging and ChatGPT-edition board import.</w:t>
+        <w:t xml:space="preserve">One owner on one machine, multiple project capable schema, a neutral sample backlog for trying the workflow, Artifact board plus snapshot fallback, MCP workflow, script reporting, evidence gates, local retry queue, resume recovery, plugin packaging and ChatGPT-edition board import.</w:t>
       </w:r>
     </w:p>
     <w:p>
@@ -1628,7 +1628,25 @@
           <w:sz-cs w:val="29"/>
           <w:spacing w:val="0"/>
         </w:rPr>
-        <w:t xml:space="preserve">Abovely is initial sample data, not hardcoded product behavior. Keep an approved scope reference and source document version.</w:t>
+        <w:t xml:space="preserve">No project is built in; the plugin ships only a neutral sample backlog (</w:t>
+      </w:r>
+      <w:r>
+        <w:rPr>
+          <w:rFonts w:ascii="Menlo" w:hAnsi="Menlo" w:cs="Menlo"/>
+          <w:sz w:val="29"/>
+          <w:sz-cs w:val="29"/>
+          <w:spacing w:val="0"/>
+        </w:rPr>
+        <w:t xml:space="preserve">plugin/samples/sample-backlog.json</w:t>
+      </w:r>
+      <w:r>
+        <w:rPr>
+          <w:rFonts w:ascii="Arial" w:hAnsi="Arial" w:cs="Arial"/>
+          <w:sz w:val="29"/>
+          <w:sz-cs w:val="29"/>
+          <w:spacing w:val="0"/>
+        </w:rPr>
+        <w:t xml:space="preserve">) for trying the workflow. Keep an approved scope reference and source document version.</w:t>
       </w:r>
     </w:p>
     <w:p>
@@ -5326,7 +5344,7 @@
           <w:sz-cs w:val="29"/>
           <w:spacing w:val="0"/>
         </w:rPr>
-        <w:t xml:space="preserve">Import the same Abovely backlog twice without duplicate stories; preserve IDs and history.</w:t>
+        <w:t xml:space="preserve">Import the same backlog twice without duplicate stories; preserve IDs and history.</w:t>
       </w:r>
     </w:p>
     <w:p>
@@ -5955,7 +5973,7 @@
           <w:sz-cs w:val="29"/>
           <w:spacing w:val="0"/>
         </w:rPr>
-        <w:t xml:space="preserve">Measure accepted criteria with qualifying evidence, shipped records linked to verified releases, prevented invalid transitions, duplicate event count, unresolved stale work, reporting recovery time and manual owner correction frequency. Establish baselines during the first Abovely epic; do not claim zero bugs from green checks.</w:t>
+        <w:t xml:space="preserve">Measure accepted criteria with qualifying evidence, shipped records linked to verified releases, prevented invalid transitions, duplicate event count, unresolved stale work, reporting recovery time and manual owner correction frequency. Establish baselines during the first tracked epic; do not claim zero bugs from green checks.</w:t>
       </w:r>
     </w:p>
     <w:p>

</xml_diff>

<commit_message>
Record revised phase scope when deferring a story
exclude_story records from_phase and deferred_to (required on strict
projects); the board lists exclusions with their target phase.

Co-Authored-By: Claude Opus 5.5 <noreply@anthropic.com>
</commit_message>
<xml_diff>
--- a/requirements/Cogumi_Claude_Kanban_PRD.docx
+++ b/requirements/Cogumi_Claude_Kanban_PRD.docx
@@ -3903,7 +3903,25 @@
           <w:sz-cs w:val="29"/>
           <w:spacing w:val="0"/>
         </w:rPr>
-        <w:t xml:space="preserve">Removing or deferring a required story requires an explicit owner decision with rationale (exclude_story, exclude_requirement); a revised phase scope is recorded through approve_scope. Keep removed records and historical evidence auditable.</w:t>
+        <w:t xml:space="preserve">Removing or deferring a required story requires an explicit owner decision, rationale and revised phase scope: exclude_story records the reason, the phase the story came from and </w:t>
+      </w:r>
+      <w:r>
+        <w:rPr>
+          <w:rFonts w:ascii="Menlo" w:hAnsi="Menlo" w:cs="Menlo"/>
+          <w:sz w:val="29"/>
+          <w:sz-cs w:val="29"/>
+          <w:spacing w:val="0"/>
+        </w:rPr>
+        <w:t xml:space="preserve">deferred_to</w:t>
+      </w:r>
+      <w:r>
+        <w:rPr>
+          <w:rFonts w:ascii="Arial" w:hAnsi="Arial" w:cs="Arial"/>
+          <w:sz w:val="29"/>
+          <w:sz-cs w:val="29"/>
+          <w:spacing w:val="0"/>
+        </w:rPr>
+        <w:t xml:space="preserve"> (the phase it moves to, or "removed"; required on strict projects), and the board shows it. Keep removed records and historical evidence auditable.</w:t>
       </w:r>
     </w:p>
     <w:p>

</xml_diff>